<commit_message>
plan: convert specification to Markdown
Agent-Logs-Url: https://github.com/Arawn-Davies/AI-IL/sessions/e5c2a9cd-ff44-4cd3-a1c6-77f7dca0e5b2

Co-authored-by: Arawn-Davies <19764552+Arawn-Davies@users.noreply.github.com>
</commit_message>
<xml_diff>
--- a/docs/Specification.docx
+++ b/docs/Specification.docx
@@ -302,8 +302,45 @@
         <w:spacing w:after="160"/>
       </w:pPr>
       <w:r>
-        <w:lastRenderedPageBreak/>
-        <w:t>Apollo Intermediate Language Specification</w:t>
+        <w:t>Apollo Intermediate Language</w:t>
+      </w:r>
+    </w:p>
+    <w:p>
+      <w:pPr/>
+      <w:r>
+        <w:rPr>
+          <w:b/>
+          <w:sz w:val="28"/>
+          <w:szCs w:val="28"/>
+        </w:rPr>
+        <w:t xml:space="preserve">Version 2.0</w:t>
+      </w:r>
+    </w:p>
+    <w:p>
+      <w:pPr/>
+      <w:r>
+        <w:rPr>
+          <w:b/>
+          <w:sz w:val="28"/>
+          <w:szCs w:val="28"/>
+        </w:rPr>
+        <w:t xml:space="preserve">Cross-Platform Edition</w:t>
+      </w:r>
+    </w:p>
+    <w:p>
+      <w:pPr/>
+      <w:r>
+        <w:rPr/>
+        <w:t xml:space="preserve"/>
+      </w:r>
+    </w:p>
+    <w:p>
+      <w:pPr/>
+      <w:r>
+        <w:rPr>
+          <w:i/>
+        </w:rPr>
+        <w:t xml:space="preserve">This document is the normative specification for AIL-compliant virtual machines. It supersedes all prior drafts. Platform-specific implementation guidance is provided in the appendices.</w:t>
       </w:r>
     </w:p>
     <w:p/>
@@ -1530,19 +1567,92 @@
       </w:pPr>
     </w:p>
     <w:p>
+      <w:pPr/>
+      <w:r>
+        <w:t xml:space="preserve">This specification defines the complete instruction set, execution model, memory layout, register file, flags, and binary executable format for AIL-compliant implementations.</w:t>
+      </w:r>
+    </w:p>
+    <w:p>
+      <w:pPr>
+        <w:pStyle w:val="ListParagraph"/>
+        <w:numPr>
+          <w:ilvl w:val="0"/>
+          <w:numId w:val="1"/>
+        </w:numPr>
+      </w:pPr>
+      <w:r>
+        <w:t xml:space="preserve">Determinism — no undefined behaviour; all edge cases are specified</w:t>
+      </w:r>
+    </w:p>
+    <w:p>
+      <w:pPr>
+        <w:pStyle w:val="ListParagraph"/>
+        <w:numPr>
+          <w:ilvl w:val="0"/>
+          <w:numId w:val="1"/>
+        </w:numPr>
+      </w:pPr>
+      <w:r>
+        <w:t xml:space="preserve">Portability — suitable for implementation in managed runtimes (.NET/CLR), native code (C/C++), and constrained hardware (e.g. Z80/CP/M)</w:t>
+      </w:r>
+    </w:p>
+    <w:p>
+      <w:pPr>
+        <w:pStyle w:val="ListParagraph"/>
+        <w:numPr>
+          <w:ilvl w:val="0"/>
+          <w:numId w:val="1"/>
+        </w:numPr>
+      </w:pPr>
+      <w:r>
+        <w:t xml:space="preserve">Simplicity — a small, orthogonal instruction set that is straightforward to implement</w:t>
+      </w:r>
+    </w:p>
+    <w:p>
+      <w:pPr>
+        <w:pStyle w:val="ListParagraph"/>
+        <w:numPr>
+          <w:ilvl w:val="0"/>
+          <w:numId w:val="1"/>
+        </w:numPr>
+      </w:pPr>
+      <w:r>
+        <w:t xml:space="preserve">Platform independence — the same AIL bytecode runs identically on any compliant VM</w:t>
+      </w:r>
+    </w:p>
+    <w:p>
+      <w:pPr/>
+      <w:r>
+        <w:t xml:space="preserve">Design goals:</w:t>
+      </w:r>
+    </w:p>
+    <w:p>
+      <w:pPr/>
+      <w:r>
+        <w:t xml:space="preserve">The Apollo Intermediate Language (AIL) is a low-level, register-based intermediate language designed for deterministic, portable execution across virtual machine implementations. It provides a stable compilation target independent of the underlying host architecture.</w:t>
+      </w:r>
+    </w:p>
+    <w:p>
+      <w:pPr>
+        <w:pStyle w:val="Heading1"/>
+      </w:pPr>
+      <w:r>
+        <w:t xml:space="preserve">1. Introduction</w:t>
+      </w:r>
+    </w:p>
+    <w:p>
       <w:pPr>
         <w:pStyle w:val="Heading1"/>
       </w:pPr>
       <w:bookmarkStart w:id="0" w:name="_gjdgxs"/>
       <w:bookmarkEnd w:id="0"/>
       <w:r>
-        <w:lastRenderedPageBreak/>
-        <w:t>Memory</w:t>
-      </w:r>
-    </w:p>
-    <w:p>
-      <w:r>
-        <w:t>There will be 64 kilobytes of addressable memory, which is the maximum amount that can be represented by 16-bit registers.</w:t>
+        <w:t>2. Memory</w:t>
+      </w:r>
+    </w:p>
+    <w:p>
+      <w:r>
+        <w:t>AIL defines a 16-bit address space providing 65,536 (64 KB) bytes of byte-addressable memory. All multi-byte values are stored in little-endian format. The address space is partitioned as follows:</w:t>
       </w:r>
     </w:p>
     <w:tbl>
@@ -1578,7 +1688,10 @@
           </w:tcPr>
           <w:p>
             <w:r>
-              <w:t>Memory start</w:t>
+              <w:rPr>
+                <w:b/>
+              </w:rPr>
+              <w:t>Start</w:t>
             </w:r>
           </w:p>
         </w:tc>
@@ -1595,7 +1708,10 @@
           </w:tcPr>
           <w:p>
             <w:r>
-              <w:t>End of memory</w:t>
+              <w:rPr>
+                <w:b/>
+              </w:rPr>
+              <w:t>End</w:t>
             </w:r>
           </w:p>
         </w:tc>
@@ -1612,6 +1728,9 @@
           </w:tcPr>
           <w:p>
             <w:r>
+              <w:rPr>
+                <w:b/>
+              </w:rPr>
               <w:t>Purpose</w:t>
             </w:r>
           </w:p>
@@ -1629,7 +1748,11 @@
             </w:tcBorders>
             <w:shd w:val="clear" w:color="auto" w:fill="auto"/>
           </w:tcPr>
-          <w:p/>
+          <w:p>
+            <w:r>
+              <w:t>0x0000</w:t>
+            </w:r>
+          </w:p>
           <w:p>
             <w:r>
               <w:t>Start of memory</w:t>
@@ -1649,7 +1772,7 @@
           </w:tcPr>
           <w:p>
             <w:r>
-              <w:t>Start of memory + 510 bytes</w:t>
+              <w:t>0x01FD</w:t>
             </w:r>
           </w:p>
         </w:tc>
@@ -1666,7 +1789,7 @@
           </w:tcPr>
           <w:p>
             <w:r>
-              <w:t>Interrupt Vector Table</w:t>
+              <w:t>Interrupt Vector Table (IVT) — 255 × 2-byte entries</w:t>
             </w:r>
           </w:p>
         </w:tc>
@@ -1685,7 +1808,7 @@
           </w:tcPr>
           <w:p>
             <w:r>
-              <w:t>0x000001FE</w:t>
+              <w:t>0x01FE</w:t>
             </w:r>
           </w:p>
         </w:tc>
@@ -1702,7 +1825,7 @@
           </w:tcPr>
           <w:p>
             <w:r>
-              <w:t>0x0000FFFF</w:t>
+              <w:t>0x01FF</w:t>
             </w:r>
           </w:p>
         </w:tc>
@@ -1719,7 +1842,7 @@
           </w:tcPr>
           <w:p>
             <w:r>
-              <w:t>Main memory</w:t>
+              <w:t>Reserved</w:t>
             </w:r>
           </w:p>
         </w:tc>
@@ -1736,7 +1859,11 @@
             </w:tcBorders>
             <w:shd w:val="clear" w:color="auto" w:fill="auto"/>
           </w:tcPr>
-          <w:p/>
+          <w:p>
+            <w:r>
+              <w:t>0x0200</w:t>
+            </w:r>
+          </w:p>
         </w:tc>
         <w:tc>
           <w:tcPr>
@@ -1749,7 +1876,11 @@
             </w:tcBorders>
             <w:shd w:val="clear" w:color="auto" w:fill="auto"/>
           </w:tcPr>
-          <w:p/>
+          <w:p>
+            <w:r>
+              <w:t>SP − 1</w:t>
+            </w:r>
+          </w:p>
         </w:tc>
         <w:tc>
           <w:tcPr>
@@ -1762,7 +1893,11 @@
             </w:tcBorders>
             <w:shd w:val="clear" w:color="auto" w:fill="auto"/>
           </w:tcPr>
-          <w:p/>
+          <w:p>
+            <w:r>
+              <w:t>General-purpose program memory (code and data)</w:t>
+            </w:r>
+          </w:p>
         </w:tc>
       </w:tr>
       <w:tr>
@@ -1796,7 +1931,7 @@
           </w:tcPr>
           <w:p>
             <w:r>
-              <w:t>End of Memory</w:t>
+              <w:t>0xFFFF</w:t>
             </w:r>
           </w:p>
         </w:tc>
@@ -1813,7 +1948,7 @@
           </w:tcPr>
           <w:p>
             <w:r>
-              <w:t>Stack</w:t>
+              <w:t>Stack (grows downward from top of memory)</w:t>
             </w:r>
           </w:p>
         </w:tc>
@@ -1827,12 +1962,12 @@
       <w:bookmarkStart w:id="1" w:name="_30j0zll"/>
       <w:bookmarkEnd w:id="1"/>
       <w:r>
-        <w:t>Instruction Encoding</w:t>
-      </w:r>
-    </w:p>
-    <w:p>
-      <w:r>
-        <w:t>Each Virtual Machine instruction is to be 48 bits wide. The first 6 of these will contain the instruction, followed by 2 bits which inform the VM how to use the parameters. If the 7</w:t>
+        <w:t>3. Instruction Encoding</w:t>
+      </w:r>
+    </w:p>
+    <w:p>
+      <w:r>
+        <w:t>Every AIL instruction is exactly 48 bits (6 bytes) wide with the following fixed layout:</w:t>
       </w:r>
       <w:r>
         <w:rPr>
@@ -1855,7 +1990,7 @@
     </w:p>
     <w:p>
       <w:r>
-        <w:t>This table displays the possible modes for addressing the parameters, along with the bit to set in the instruction.</w:t>
+        <w:t>The two-bit address mode field controls how the VM interprets each parameter:</w:t>
       </w:r>
     </w:p>
     <w:tbl>
@@ -1893,7 +2028,10 @@
           </w:tcPr>
           <w:p>
             <w:r>
-              <w:t>Addressing mode bit value</w:t>
+              <w:rPr>
+                <w:b/>
+              </w:rPr>
+              <w:t>Binary / Hex</w:t>
             </w:r>
           </w:p>
           <w:p>
@@ -1915,7 +2053,10 @@
           </w:tcPr>
           <w:p>
             <w:r>
-              <w:t>Mode for addressing parameters</w:t>
+              <w:rPr>
+                <w:b/>
+              </w:rPr>
+              <w:t>Mode</w:t>
             </w:r>
           </w:p>
         </w:tc>
@@ -1937,7 +2078,7 @@
           </w:tcPr>
           <w:p>
             <w:r>
-              <w:t>0000/0x00</w:t>
+              <w:t>00 / 0x00</w:t>
             </w:r>
           </w:p>
         </w:tc>
@@ -1954,7 +2095,7 @@
           </w:tcPr>
           <w:p>
             <w:r>
-              <w:t>&lt;Register&gt;:&lt;Register&gt;</w:t>
+              <w:t>Register ∶ Register</w:t>
             </w:r>
           </w:p>
         </w:tc>
@@ -1976,7 +2117,7 @@
           </w:tcPr>
           <w:p>
             <w:r>
-              <w:t>0001/0x01</w:t>
+              <w:t>01 / 0x01</w:t>
             </w:r>
           </w:p>
         </w:tc>
@@ -1993,7 +2134,7 @@
           </w:tcPr>
           <w:p>
             <w:r>
-              <w:t>&lt;Value&gt;:&lt;Register&gt;</w:t>
+              <w:t>Value ∶ Register</w:t>
             </w:r>
           </w:p>
         </w:tc>
@@ -2015,7 +2156,7 @@
           </w:tcPr>
           <w:p>
             <w:r>
-              <w:t>0010/0x02</w:t>
+              <w:t>10 / 0x02</w:t>
             </w:r>
           </w:p>
         </w:tc>
@@ -2032,7 +2173,7 @@
           </w:tcPr>
           <w:p>
             <w:r>
-              <w:t>&lt;Register&gt;:&lt;Value&gt;</w:t>
+              <w:t>Register ∶ Value</w:t>
             </w:r>
           </w:p>
         </w:tc>
@@ -2054,7 +2195,7 @@
           </w:tcPr>
           <w:p>
             <w:r>
-              <w:t>0011/0x03</w:t>
+              <w:t>11 / 0x03</w:t>
             </w:r>
           </w:p>
         </w:tc>
@@ -2071,7 +2212,7 @@
           </w:tcPr>
           <w:p>
             <w:r>
-              <w:t>&lt;Value&gt;:&lt;Value&gt;</w:t>
+              <w:t>Value ∶ Value</w:t>
             </w:r>
           </w:p>
         </w:tc>
@@ -2120,7 +2261,10 @@
           </w:tcPr>
           <w:p>
             <w:r>
-              <w:t>6 bits</w:t>
+              <w:rPr>
+                <w:b/>
+              </w:rPr>
+              <w:t>Bits</w:t>
             </w:r>
           </w:p>
         </w:tc>
@@ -2137,7 +2281,10 @@
           </w:tcPr>
           <w:p>
             <w:r>
-              <w:t>2 bits</w:t>
+              <w:rPr>
+                <w:b/>
+              </w:rPr>
+              <w:t>Width</w:t>
             </w:r>
           </w:p>
         </w:tc>
@@ -2154,7 +2301,10 @@
           </w:tcPr>
           <w:p>
             <w:r>
-              <w:t>1 byte (8 bits)</w:t>
+              <w:rPr>
+                <w:b/>
+              </w:rPr>
+              <w:t>Field</w:t>
             </w:r>
           </w:p>
         </w:tc>
@@ -2171,7 +2321,10 @@
           </w:tcPr>
           <w:p>
             <w:r>
-              <w:t>4 bytes (32 bits)</w:t>
+              <w:rPr>
+                <w:b/>
+              </w:rPr>
+              <w:t>Description</w:t>
             </w:r>
           </w:p>
         </w:tc>
@@ -2193,7 +2346,7 @@
           </w:tcPr>
           <w:p>
             <w:r>
-              <w:t>Instruction</w:t>
+              <w:t>47–42</w:t>
             </w:r>
           </w:p>
         </w:tc>
@@ -2210,7 +2363,153 @@
           </w:tcPr>
           <w:p>
             <w:r>
+              <w:t>6 bits</w:t>
+            </w:r>
+          </w:p>
+        </w:tc>
+        <w:tc>
+          <w:tcPr>
+            <w:tcW w:w="1984" w:type="dxa"/>
+            <w:tcBorders>
+              <w:top w:val="single" w:sz="4" w:space="0" w:color="000000"/>
+              <w:left w:val="single" w:sz="4" w:space="0" w:color="000000"/>
+              <w:bottom w:val="single" w:sz="4" w:space="0" w:color="000000"/>
+              <w:right w:val="single" w:sz="4" w:space="0" w:color="000000"/>
+            </w:tcBorders>
+            <w:shd w:val="clear" w:color="auto" w:fill="auto"/>
+          </w:tcPr>
+          <w:p>
+            <w:r>
+              <w:t>Opcode</w:t>
+            </w:r>
+          </w:p>
+        </w:tc>
+        <w:tc>
+          <w:tcPr>
+            <w:tcW w:w="2126" w:type="dxa"/>
+            <w:tcBorders>
+              <w:top w:val="single" w:sz="4" w:space="0" w:color="000000"/>
+              <w:left w:val="single" w:sz="4" w:space="0" w:color="000000"/>
+              <w:bottom w:val="single" w:sz="4" w:space="0" w:color="000000"/>
+              <w:right w:val="single" w:sz="4" w:space="0" w:color="000000"/>
+            </w:tcBorders>
+            <w:shd w:val="clear" w:color="auto" w:fill="auto"/>
+          </w:tcPr>
+          <w:p>
+            <w:r>
+              <w:t>Identifies the instruction</w:t>
+            </w:r>
+          </w:p>
+        </w:tc>
+      </w:tr>
+      <w:tr>
+        <w:trPr>
+          <w:jc w:val="center"/>
+        </w:trPr>
+        <w:tc>
+          <w:tcPr>
+            <w:tcW w:w="1980" w:type="dxa"/>
+            <w:tcBorders>
+              <w:top w:val="single" w:sz="4" w:space="0" w:color="000000"/>
+              <w:left w:val="single" w:sz="4" w:space="0" w:color="000000"/>
+              <w:bottom w:val="single" w:sz="4" w:space="0" w:color="000000"/>
+              <w:right w:val="single" w:sz="4" w:space="0" w:color="000000"/>
+            </w:tcBorders>
+            <w:shd w:val="clear" w:color="auto" w:fill="auto"/>
+          </w:tcPr>
+          <w:p>
+            <w:r>
+              <w:t>41–40</w:t>
+            </w:r>
+          </w:p>
+        </w:tc>
+        <w:tc>
+          <w:tcPr>
+            <w:tcW w:w="2126" w:type="dxa"/>
+            <w:tcBorders>
+              <w:top w:val="single" w:sz="4" w:space="0" w:color="000000"/>
+              <w:left w:val="single" w:sz="4" w:space="0" w:color="000000"/>
+              <w:bottom w:val="single" w:sz="4" w:space="0" w:color="000000"/>
+              <w:right w:val="single" w:sz="4" w:space="0" w:color="000000"/>
+            </w:tcBorders>
+            <w:shd w:val="clear" w:color="auto" w:fill="auto"/>
+          </w:tcPr>
+          <w:p>
+            <w:r>
+              <w:t>2 bits</w:t>
+            </w:r>
+          </w:p>
+        </w:tc>
+        <w:tc>
+          <w:tcPr>
+            <w:tcW w:w="1984" w:type="dxa"/>
+            <w:tcBorders>
+              <w:top w:val="single" w:sz="4" w:space="0" w:color="000000"/>
+              <w:left w:val="single" w:sz="4" w:space="0" w:color="000000"/>
+              <w:bottom w:val="single" w:sz="4" w:space="0" w:color="000000"/>
+              <w:right w:val="single" w:sz="4" w:space="0" w:color="000000"/>
+            </w:tcBorders>
+            <w:shd w:val="clear" w:color="auto" w:fill="auto"/>
+          </w:tcPr>
+          <w:p>
+            <w:r>
               <w:t>Address Mode</w:t>
+            </w:r>
+          </w:p>
+        </w:tc>
+        <w:tc>
+          <w:tcPr>
+            <w:tcW w:w="2126" w:type="dxa"/>
+            <w:tcBorders>
+              <w:top w:val="single" w:sz="4" w:space="0" w:color="000000"/>
+              <w:left w:val="single" w:sz="4" w:space="0" w:color="000000"/>
+              <w:bottom w:val="single" w:sz="4" w:space="0" w:color="000000"/>
+              <w:right w:val="single" w:sz="4" w:space="0" w:color="000000"/>
+            </w:tcBorders>
+            <w:shd w:val="clear" w:color="auto" w:fill="auto"/>
+          </w:tcPr>
+          <w:p>
+            <w:r>
+              <w:t>How parameters are interpreted (see §3.1)</w:t>
+            </w:r>
+          </w:p>
+        </w:tc>
+      </w:tr>
+      <w:tr>
+        <w:trPr>
+          <w:jc w:val="center"/>
+        </w:trPr>
+        <w:tc>
+          <w:tcPr>
+            <w:tcW w:w="1980" w:type="dxa"/>
+            <w:tcBorders>
+              <w:top w:val="single" w:sz="4" w:space="0" w:color="000000"/>
+              <w:left w:val="single" w:sz="4" w:space="0" w:color="000000"/>
+              <w:bottom w:val="single" w:sz="4" w:space="0" w:color="000000"/>
+              <w:right w:val="single" w:sz="4" w:space="0" w:color="000000"/>
+            </w:tcBorders>
+            <w:shd w:val="clear" w:color="auto" w:fill="auto"/>
+          </w:tcPr>
+          <w:p>
+            <w:r>
+              <w:t>39–32</w:t>
+            </w:r>
+          </w:p>
+        </w:tc>
+        <w:tc>
+          <w:tcPr>
+            <w:tcW w:w="2126" w:type="dxa"/>
+            <w:tcBorders>
+              <w:top w:val="single" w:sz="4" w:space="0" w:color="000000"/>
+              <w:left w:val="single" w:sz="4" w:space="0" w:color="000000"/>
+              <w:bottom w:val="single" w:sz="4" w:space="0" w:color="000000"/>
+              <w:right w:val="single" w:sz="4" w:space="0" w:color="000000"/>
+            </w:tcBorders>
+            <w:shd w:val="clear" w:color="auto" w:fill="auto"/>
+          </w:tcPr>
+          <w:p>
+            <w:r>
+              <w:t>8 bits</w:t>
             </w:r>
           </w:p>
         </w:tc>
@@ -2244,7 +2543,80 @@
           </w:tcPr>
           <w:p>
             <w:r>
+              <w:t>First operand (register byte or immediate)</w:t>
+            </w:r>
+          </w:p>
+        </w:tc>
+      </w:tr>
+      <w:tr>
+        <w:trPr>
+          <w:jc w:val="center"/>
+        </w:trPr>
+        <w:tc>
+          <w:tcPr>
+            <w:tcW w:w="1980" w:type="dxa"/>
+            <w:tcBorders>
+              <w:top w:val="single" w:sz="4" w:space="0" w:color="000000"/>
+              <w:left w:val="single" w:sz="4" w:space="0" w:color="000000"/>
+              <w:bottom w:val="single" w:sz="4" w:space="0" w:color="000000"/>
+              <w:right w:val="single" w:sz="4" w:space="0" w:color="000000"/>
+            </w:tcBorders>
+            <w:shd w:val="clear" w:color="auto" w:fill="auto"/>
+          </w:tcPr>
+          <w:p>
+            <w:r>
+              <w:t>31–0</w:t>
+            </w:r>
+          </w:p>
+        </w:tc>
+        <w:tc>
+          <w:tcPr>
+            <w:tcW w:w="2126" w:type="dxa"/>
+            <w:tcBorders>
+              <w:top w:val="single" w:sz="4" w:space="0" w:color="000000"/>
+              <w:left w:val="single" w:sz="4" w:space="0" w:color="000000"/>
+              <w:bottom w:val="single" w:sz="4" w:space="0" w:color="000000"/>
+              <w:right w:val="single" w:sz="4" w:space="0" w:color="000000"/>
+            </w:tcBorders>
+            <w:shd w:val="clear" w:color="auto" w:fill="auto"/>
+          </w:tcPr>
+          <w:p>
+            <w:r>
+              <w:t>32 bits</w:t>
+            </w:r>
+          </w:p>
+        </w:tc>
+        <w:tc>
+          <w:tcPr>
+            <w:tcW w:w="1984" w:type="dxa"/>
+            <w:tcBorders>
+              <w:top w:val="single" w:sz="4" w:space="0" w:color="000000"/>
+              <w:left w:val="single" w:sz="4" w:space="0" w:color="000000"/>
+              <w:bottom w:val="single" w:sz="4" w:space="0" w:color="000000"/>
+              <w:right w:val="single" w:sz="4" w:space="0" w:color="000000"/>
+            </w:tcBorders>
+            <w:shd w:val="clear" w:color="auto" w:fill="auto"/>
+          </w:tcPr>
+          <w:p>
+            <w:r>
               <w:t>Parameter 2</w:t>
+            </w:r>
+          </w:p>
+        </w:tc>
+        <w:tc>
+          <w:tcPr>
+            <w:tcW w:w="2126" w:type="dxa"/>
+            <w:tcBorders>
+              <w:top w:val="single" w:sz="4" w:space="0" w:color="000000"/>
+              <w:left w:val="single" w:sz="4" w:space="0" w:color="000000"/>
+              <w:bottom w:val="single" w:sz="4" w:space="0" w:color="000000"/>
+              <w:right w:val="single" w:sz="4" w:space="0" w:color="000000"/>
+            </w:tcBorders>
+            <w:shd w:val="clear" w:color="auto" w:fill="auto"/>
+          </w:tcPr>
+          <w:p>
+            <w:r>
+              <w:t>Second operand (register byte or 32-bit immediate)</w:t>
             </w:r>
           </w:p>
         </w:tc>
@@ -2258,7 +2630,7 @@
       <w:bookmarkStart w:id="2" w:name="_1fob9te"/>
       <w:bookmarkEnd w:id="2"/>
       <w:r>
-        <w:t>Pointers and registers</w:t>
+        <w:t>4. Pointers and Registers</w:t>
       </w:r>
     </w:p>
     <w:p>

</xml_diff>